<commit_message>
Korrigiere Fall-3-Subformeln in den Angriffs-Arbeitsblättern
Die Schaden-Formel hatte in allen drei Dokumenten das falsche Vorzeichen
(reduzierte Schaden mit steigender Gesamtreduktion statt umgekehrt) und
reproduzierte dadurch nicht die in Fall 1/Fall 2 selbst festgelegten Werte.
Bei Welle 2 (OT) und Welle 3 (Exfiltration) war zusätzlich die KZ-Steigung
falsch (überall "*2" kopiert, passt aber nur bei Welle 1 zufällig).

Alle Formeln jetzt so angepasst, dass sie an beiden Rändern (Fall 1 und
Fall 2) exakt die dort gedruckten Werte ergeben - entspricht der bereits
in simulate_outcomes.py implementierten linearen Interpolation zwischen
kz_at_full_damage und kz_at_full_mitigation.
</commit_message>
<xml_diff>
--- a/final_documents/Angriff-1_Ransomware.docx
+++ b/final_documents/Angriff-1_Ransomware.docx
@@ -2951,7 +2951,7 @@
           <w:szCs w:val="20"/>
           <w:highlight w:val="none"/>
         </w:rPr>
-        <w:t xml:space="preserve">Schaden = (Gesamtreduktion </w:t>
+        <w:t xml:space="preserve">Schaden = (23 - Gesamtreduktion ____________) * 20.000 € = ____________ </w:t>
       </w:r>
       <w:r>
         <w:rPr>
@@ -2959,7 +2959,6 @@
           <w:szCs w:val="20"/>
           <w:highlight w:val="none"/>
         </w:rPr>
-        <w:t xml:space="preserve">____________ - 15) * 20.000 € = </w:t>
       </w:r>
       <w:r>
         <w:rPr>
@@ -2967,7 +2966,6 @@
           <w:szCs w:val="20"/>
           <w:highlight w:val="none"/>
         </w:rPr>
-        <w:t xml:space="preserve">____________ </w:t>
       </w:r>
       <w:r>
         <w:rPr>

</xml_diff>